<commit_message>
docs(handover): final state - Drive verified live, fsMod scope fix and /settings/drive rule confirmed on the deployed site
</commit_message>
<xml_diff>
--- a/docs/NGF-পরিবর্তন-২০২৬-০৯-১৫.docx
+++ b/docs/NGF-পরিবর্তন-২০২৬-০৯-১৫.docx
@@ -8,7 +8,7 @@
           <w:b/>
           <w:sz w:val="32"/>
         </w:rPr>
-        <w:t>NGF — ১৫ সেপ্টেম্বর ২০২৬-এর পরিবর্তনসমূহ: হস্তান্তর ও যাচাই প্রতিবেদন</w:t>
+        <w:t>NextGen Fund — সাতটি পরিবর্তনের হস্তান্তর ও যাচাই প্রতিবেদন</w:t>
       </w:r>
     </w:p>
     <w:p>
@@ -18,7 +18,7 @@
           <w:i w:val="0"/>
           <w:sz w:val="17"/>
         </w:rPr>
-        <w:t>ওয়েবসাইট: https://nextgenfund.web.app/  ·  সোর্স: github.com/iamatiq7/nextgen-fund  ·  প্রস্তুতকারী: ATIQ.V2</w:t>
+        <w:t>তারিখ: ১৫ সেপ্টেম্বর ২০২৬  ·  লাইভ: https://nextgenfund.web.app/  ·  পুরোনো ঠিকানা: https://nextgen-fund-2040.web.app/  ·  সোর্স: github.com/iamatiq7/nextgen-fund</w:t>
       </w:r>
     </w:p>
     <w:p>
@@ -29,7 +29,7 @@
         <w:rPr>
           <w:color w:val="1B2A49"/>
         </w:rPr>
-        <w:t>১. আপনার সাতটি নির্দেশের অবস্থা</w:t>
+        <w:t>১. সাতটি নির্দেশের চূড়ান্ত অবস্থা</w:t>
       </w:r>
     </w:p>
     <w:tbl>
@@ -62,7 +62,7 @@
         </w:tc>
         <w:tc>
           <w:tcPr>
-            <w:tcW w:type="dxa" w:w="3024"/>
+            <w:tcW w:type="dxa" w:w="2952"/>
           </w:tcPr>
           <w:p>
             <w:r/>
@@ -76,7 +76,7 @@
         </w:tc>
         <w:tc>
           <w:tcPr>
-            <w:tcW w:type="dxa" w:w="1944"/>
+            <w:tcW w:type="dxa" w:w="1800"/>
           </w:tcPr>
           <w:p>
             <w:r/>
@@ -90,7 +90,7 @@
         </w:tc>
         <w:tc>
           <w:tcPr>
-            <w:tcW w:type="dxa" w:w="4176"/>
+            <w:tcW w:type="dxa" w:w="4392"/>
           </w:tcPr>
           <w:p>
             <w:r/>
@@ -98,7 +98,7 @@
               <w:rPr>
                 <w:b/>
               </w:rPr>
-              <w:t>প্রমাণ / মন্তব্য</w:t>
+              <w:t>প্রমাণ</w:t>
             </w:r>
           </w:p>
         </w:tc>
@@ -116,7 +116,7 @@
         </w:tc>
         <w:tc>
           <w:tcPr>
-            <w:tcW w:type="dxa" w:w="3024"/>
+            <w:tcW w:type="dxa" w:w="2952"/>
           </w:tcPr>
           <w:p>
             <w:r>
@@ -126,7 +126,7 @@
         </w:tc>
         <w:tc>
           <w:tcPr>
-            <w:tcW w:type="dxa" w:w="1944"/>
+            <w:tcW w:type="dxa" w:w="1800"/>
           </w:tcPr>
           <w:p>
             <w:r>
@@ -136,11 +136,11 @@
         </w:tc>
         <w:tc>
           <w:tcPr>
-            <w:tcW w:type="dxa" w:w="4176"/>
+            <w:tcW w:type="dxa" w:w="4392"/>
           </w:tcPr>
           <w:p>
             <w:r>
-              <w:t>common.js-এ mode.live নেই, footer-এর Setup লিংক বাদ, admin overview-র live-notice বাদ (cache-busted live যাচাই)</w:t>
+              <w:t>common.js-এ লাইভ মোডে ব্যাজ/লেবেল ফাঁকা, footer-এর Setup লিংক বাদ, admin notice বাদ</w:t>
             </w:r>
           </w:p>
         </w:tc>
@@ -158,17 +158,17 @@
         </w:tc>
         <w:tc>
           <w:tcPr>
-            <w:tcW w:type="dxa" w:w="3024"/>
+            <w:tcW w:type="dxa" w:w="2952"/>
           </w:tcPr>
           <w:p>
             <w:r>
-              <w:t>ড্যাশবোর্ড সবার জন্য, লগইন/রেজিস্ট্রেশন ছাড়াই</w:t>
+              <w:t>ড্যাশবোর্ড সবার জন্য (লগইন/রেজিস্ট্রেশন ছাড়াই)</w:t>
             </w:r>
           </w:p>
         </w:tc>
         <w:tc>
           <w:tcPr>
-            <w:tcW w:type="dxa" w:w="1944"/>
+            <w:tcW w:type="dxa" w:w="1800"/>
           </w:tcPr>
           <w:p>
             <w:r>
@@ -178,7 +178,7 @@
         </w:tc>
         <w:tc>
           <w:tcPr>
-            <w:tcW w:type="dxa" w:w="4176"/>
+            <w:tcW w:type="dxa" w:w="4392"/>
           </w:tcPr>
           <w:p>
             <w:r>
@@ -200,7 +200,7 @@
         </w:tc>
         <w:tc>
           <w:tcPr>
-            <w:tcW w:type="dxa" w:w="3024"/>
+            <w:tcW w:type="dxa" w:w="2952"/>
           </w:tcPr>
           <w:p>
             <w:r>
@@ -210,7 +210,7 @@
         </w:tc>
         <w:tc>
           <w:tcPr>
-            <w:tcW w:type="dxa" w:w="1944"/>
+            <w:tcW w:type="dxa" w:w="1800"/>
           </w:tcPr>
           <w:p>
             <w:r>
@@ -220,11 +220,11 @@
         </w:tc>
         <w:tc>
           <w:tcPr>
-            <w:tcW w:type="dxa" w:w="4176"/>
+            <w:tcW w:type="dxa" w:w="4392"/>
           </w:tcPr>
           <w:p>
             <w:r>
-              <w:t>dashboard.js সেশন থাকলে .sec-member/.sec-methods-এ hide; অতিথি দেখে</w:t>
+              <w:t>dashboard.js সেশন থাকলে .sec-member/.sec-methods লুকায়; অতিথি দেখে</w:t>
             </w:r>
           </w:p>
         </w:tc>
@@ -242,7 +242,7 @@
         </w:tc>
         <w:tc>
           <w:tcPr>
-            <w:tcW w:type="dxa" w:w="3024"/>
+            <w:tcW w:type="dxa" w:w="2952"/>
           </w:tcPr>
           <w:p>
             <w:r>
@@ -252,7 +252,7 @@
         </w:tc>
         <w:tc>
           <w:tcPr>
-            <w:tcW w:type="dxa" w:w="1944"/>
+            <w:tcW w:type="dxa" w:w="1800"/>
           </w:tcPr>
           <w:p>
             <w:r>
@@ -262,11 +262,11 @@
         </w:tc>
         <w:tc>
           <w:tcPr>
-            <w:tcW w:type="dxa" w:w="4176"/>
+            <w:tcW w:type="dxa" w:w="4392"/>
           </w:tcPr>
           <w:p>
             <w:r>
-              <w:t>funding = verified deposits + revenue − loss; net = funding; manual funding রো উপেক্ষিত; store.test ৬০/৬০</w:t>
+              <w:t>funding = ডিপোজিট+revenue−loss; net = funding; store.test ৬০/৬০</w:t>
             </w:r>
           </w:p>
         </w:tc>
@@ -284,17 +284,17 @@
         </w:tc>
         <w:tc>
           <w:tcPr>
-            <w:tcW w:type="dxa" w:w="3024"/>
+            <w:tcW w:type="dxa" w:w="2952"/>
           </w:tcPr>
           <w:p>
             <w:r>
-              <w:t>site content আসলে কী — ব্যাখ্যা</w:t>
+              <w:t>site content কী — ব্যাখ্যা</w:t>
             </w:r>
           </w:p>
         </w:tc>
         <w:tc>
           <w:tcPr>
-            <w:tcW w:type="dxa" w:w="1944"/>
+            <w:tcW w:type="dxa" w:w="1800"/>
           </w:tcPr>
           <w:p>
             <w:r>
@@ -304,11 +304,11 @@
         </w:tc>
         <w:tc>
           <w:tcPr>
-            <w:tcW w:type="dxa" w:w="4176"/>
+            <w:tcW w:type="dxa" w:w="4392"/>
           </w:tcPr>
           <w:p>
             <w:r>
-              <w:t>docs/site-content-and-documents.md — আপনার হাতে রাখার ৬টি ঘর</w:t>
+              <w:t>docs/site-content-and-documents.md (৬টি এডিটেবল ঘর)</w:t>
             </w:r>
           </w:p>
         </w:tc>
@@ -326,7 +326,7 @@
         </w:tc>
         <w:tc>
           <w:tcPr>
-            <w:tcW w:type="dxa" w:w="3024"/>
+            <w:tcW w:type="dxa" w:w="2952"/>
           </w:tcPr>
           <w:p>
             <w:r>
@@ -336,21 +336,21 @@
         </w:tc>
         <w:tc>
           <w:tcPr>
-            <w:tcW w:type="dxa" w:w="1944"/>
+            <w:tcW w:type="dxa" w:w="1800"/>
           </w:tcPr>
           <w:p>
             <w:r>
-              <w:t>কোড সম্পূর্ণ; আপনার ১ ধাপ বাকি</w:t>
+              <w:t>সম্পূর্ণ ও যাচাইকৃত</w:t>
             </w:r>
           </w:p>
         </w:tc>
         <w:tc>
           <w:tcPr>
-            <w:tcW w:type="dxa" w:w="4176"/>
+            <w:tcW w:type="dxa" w:w="4392"/>
           </w:tcPr>
           <w:p>
             <w:r>
-              <w:t>Drive ক্লায়েন্ট path ৯/৯ PASS (mock endpoint); Apps Script ডিপ্লয় করা বাকি</w:t>
+              <w:t>লাইভ POST: ৪টি ফাইল তৈরি (নিচে §৩)</w:t>
             </w:r>
           </w:p>
         </w:tc>
@@ -368,7 +368,7 @@
         </w:tc>
         <w:tc>
           <w:tcPr>
-            <w:tcW w:type="dxa" w:w="3024"/>
+            <w:tcW w:type="dxa" w:w="2952"/>
           </w:tcPr>
           <w:p>
             <w:r>
@@ -378,7 +378,7 @@
         </w:tc>
         <w:tc>
           <w:tcPr>
-            <w:tcW w:type="dxa" w:w="1944"/>
+            <w:tcW w:type="dxa" w:w="1800"/>
           </w:tcPr>
           <w:p>
             <w:r>
@@ -388,11 +388,11 @@
         </w:tc>
         <w:tc>
           <w:tcPr>
-            <w:tcW w:type="dxa" w:w="4176"/>
+            <w:tcW w:type="dxa" w:w="4392"/>
           </w:tcPr>
           <w:p>
             <w:r>
-              <w:t>portal ফর্ম → nomineeRequests → admin ট্যাব → Approve/Reject + audit; rules ডিপ্লয়</w:t>
+              <w:t>portal ফর্ম → nomineeRequests → admin Approve/Reject + audit; rules ডিপ্লয়</w:t>
             </w:r>
           </w:p>
         </w:tc>
@@ -407,16 +407,7 @@
         <w:rPr>
           <w:color w:val="1B2A49"/>
         </w:rPr>
-        <w:t>২. ডকুমেন্ট কোথায় যায় (স্থাপত্য)</w:t>
-      </w:r>
-    </w:p>
-    <w:p>
-      <w:r>
-        <w:rPr>
-          <w:b/>
-          <w:i w:val="0"/>
-        </w:rPr>
-        <w:t>এক নজরে:</w:t>
+        <w:t>২. ডকুমেন্ট প্রবাহ</w:t>
       </w:r>
     </w:p>
     <w:tbl>
@@ -433,7 +424,7 @@
       <w:tr>
         <w:tc>
           <w:tcPr>
-            <w:tcW w:type="dxa" w:w="2448"/>
+            <w:tcW w:type="dxa" w:w="576"/>
           </w:tcPr>
           <w:p>
             <w:r/>
@@ -447,7 +438,7 @@
         </w:tc>
         <w:tc>
           <w:tcPr>
-            <w:tcW w:type="dxa" w:w="7200"/>
+            <w:tcW w:type="dxa" w:w="9072"/>
           </w:tcPr>
           <w:p>
             <w:r/>
@@ -463,21 +454,21 @@
       <w:tr>
         <w:tc>
           <w:tcPr>
-            <w:tcW w:type="dxa" w:w="2448"/>
+            <w:tcW w:type="dxa" w:w="576"/>
           </w:tcPr>
           <w:p>
             <w:r>
-              <w:t>১. সদস্য চারটি ফাইল বাছে</w:t>
+              <w:t>১</w:t>
             </w:r>
           </w:p>
         </w:tc>
         <w:tc>
           <w:tcPr>
-            <w:tcW w:type="dxa" w:w="7200"/>
+            <w:tcW w:type="dxa" w:w="9072"/>
           </w:tcPr>
           <w:p>
             <w:r>
-              <w:t>nid-front · nid-back · profile-picture · nominee-passport-photo (চারটিই বাধ্যতামূলক)</w:t>
+              <w:t>সদস্য চারটি ফাইল বাছে: nid-front · nid-back · profile-picture · nominee-passport-photo (চারটিই বাধ্যতামূলক)</w:t>
             </w:r>
           </w:p>
         </w:tc>
@@ -485,21 +476,21 @@
       <w:tr>
         <w:tc>
           <w:tcPr>
-            <w:tcW w:type="dxa" w:w="2448"/>
+            <w:tcW w:type="dxa" w:w="576"/>
           </w:tcPr>
           <w:p>
             <w:r>
-              <w:t>২. ব্রাউজারে ছবি ছোট হয়</w:t>
+              <w:t>২</w:t>
             </w:r>
           </w:p>
         </w:tc>
         <w:tc>
           <w:tcPr>
-            <w:tcW w:type="dxa" w:w="7200"/>
+            <w:tcW w:type="dxa" w:w="9072"/>
           </w:tcPr>
           <w:p>
             <w:r>
-              <w:t>সর্বোচ্চ ১০০০px/০.৭২ গুণমান → দরকার হলে ৭২০px → ৫৬০px (ক্ষতিরোধী কপি)</w:t>
+              <w:t>ব্রাউজারেই ছবি ছোট হয় (১০০০px/০.৭২ → দরকার হলে ৭২০ → ৫৬০)</w:t>
             </w:r>
           </w:p>
         </w:tc>
@@ -507,21 +498,21 @@
       <w:tr>
         <w:tc>
           <w:tcPr>
-            <w:tcW w:type="dxa" w:w="2448"/>
+            <w:tcW w:type="dxa" w:w="576"/>
           </w:tcPr>
           <w:p>
             <w:r>
-              <w:t>৩. Drive সেট থাকলে</w:t>
+              <w:t>৩</w:t>
             </w:r>
           </w:p>
         </w:tc>
         <w:tc>
           <w:tcPr>
-            <w:tcW w:type="dxa" w:w="7200"/>
+            <w:tcW w:type="dxa" w:w="9072"/>
           </w:tcPr>
           <w:p>
             <w:r>
-              <w:t>পূর্ণ মানের ফাইল Apps Script endpoint-এ যায়; স্ক্রিপ্ট &lt;username&gt; ফোল্ডার বানিয়ে ঠিক ওই চার নামে রাখে (আগের একই নামের ফাইল মুছে দেয়)</w:t>
+              <w:t>Drive সেট থাকলে পূর্ণ মানের ফাইল Apps Script-এ যায়; স্ক্রিপ্ট &lt;username&gt; ফোল্ডার বানিয়ে ঠিক ওই চার নামে রাখে (আগের একই নামের ফাইল মুছে)</w:t>
             </w:r>
           </w:p>
         </w:tc>
@@ -529,21 +520,21 @@
       <w:tr>
         <w:tc>
           <w:tcPr>
-            <w:tcW w:type="dxa" w:w="2448"/>
+            <w:tcW w:type="dxa" w:w="576"/>
           </w:tcPr>
           <w:p>
             <w:r>
-              <w:t>৪. রেকর্ডে থাকে</w:t>
+              <w:t>৪</w:t>
             </w:r>
           </w:p>
         </w:tc>
         <w:tc>
           <w:tcPr>
-            <w:tcW w:type="dxa" w:w="7200"/>
+            <w:tcW w:type="dxa" w:w="9072"/>
           </w:tcPr>
           <w:p>
             <w:r>
-              <w:t>Drive লিংক (ফাইল আইডি সহ) — কে, কখন, কোন ফাইল, Drive-এ কোথায়</w:t>
+              <w:t>রেকর্ডে থাকে Drive লিংক + ফাইল আইডি (কে, কখন, কোন ফাইল, কোথায়)</w:t>
             </w:r>
           </w:p>
         </w:tc>
@@ -551,21 +542,21 @@
       <w:tr>
         <w:tc>
           <w:tcPr>
-            <w:tcW w:type="dxa" w:w="2448"/>
+            <w:tcW w:type="dxa" w:w="576"/>
           </w:tcPr>
           <w:p>
             <w:r>
-              <w:t>৫. Drive না থাকলে</w:t>
+              <w:t>৫</w:t>
             </w:r>
           </w:p>
         </w:tc>
         <w:tc>
           <w:tcPr>
-            <w:tcW w:type="dxa" w:w="7200"/>
+            <w:tcW w:type="dxa" w:w="9072"/>
           </w:tcPr>
           <w:p>
             <w:r>
-              <w:t>ছোট কপিটি রেকর্ডের সঙ্গে থাকে; অ্যাডমিন প্যানেল থেকে সঠিক নামে ডাউনলোড করা যায়</w:t>
+              <w:t>Drive সেট না থাকলে ছোট কপি রেকর্ডের সঙ্গে; অ্যাডমিন প্যানেল থেকে সঠিক নামে ডাউনলোড</w:t>
             </w:r>
           </w:p>
         </w:tc>
@@ -579,7 +570,7 @@
           <w:i w:val="0"/>
           <w:sz w:val="18"/>
         </w:rPr>
-        <w:t>Apps Script: tools/drive-upload/Code.gs · ডিপ্লয়: Deploy → New deployment → Web app · Execute as: me · Who has access: Anyone → /exec URL → অ্যাডমিন প্যানেলে Settings → “সদস্যের ডকুমেন্ট (Google Drive)” → Save। নোট: access “Anyone” না হলে ব্রাউজার উত্তর পড়তে পারে না (CORS) — আপলোডে “Failed to fetch” এলে এটি দেখুন।</w:t>
+        <w:t>সেটিং: অ্যাডমিন প্যানেল → Settings → “সদস্যের ডকুমেন্ট (Google Drive)” → /exec URL → Save। Apps Script ডিপ্লয়: Deploy → New deployment → Web app · Execute as: me · Who has access: Anyone। “Anyone” না হলে ব্রাউজার উত্তর পড়তে পারে না (CORS)।</w:t>
       </w:r>
     </w:p>
     <w:p>
@@ -590,7 +581,7 @@
         <w:rPr>
           <w:color w:val="1B2A49"/>
         </w:rPr>
-        <w:t>৩. যাচাইয়ের ফল</w:t>
+        <w:t>৩. যাচাইয়ের ফল (সবই বাস্তবে চালানো)</w:t>
       </w:r>
     </w:p>
     <w:tbl>
@@ -608,7 +599,7 @@
       <w:tr>
         <w:tc>
           <w:tcPr>
-            <w:tcW w:type="dxa" w:w="2736"/>
+            <w:tcW w:type="dxa" w:w="2520"/>
           </w:tcPr>
           <w:p>
             <w:r/>
@@ -622,7 +613,7 @@
         </w:tc>
         <w:tc>
           <w:tcPr>
-            <w:tcW w:type="dxa" w:w="4896"/>
+            <w:tcW w:type="dxa" w:w="5040"/>
           </w:tcPr>
           <w:p>
             <w:r/>
@@ -636,7 +627,7 @@
         </w:tc>
         <w:tc>
           <w:tcPr>
-            <w:tcW w:type="dxa" w:w="2016"/>
+            <w:tcW w:type="dxa" w:w="2088"/>
           </w:tcPr>
           <w:p>
             <w:r/>
@@ -652,27 +643,59 @@
       <w:tr>
         <w:tc>
           <w:tcPr>
-            <w:tcW w:type="dxa" w:w="2736"/>
+            <w:tcW w:type="dxa" w:w="2520"/>
           </w:tcPr>
           <w:p>
             <w:r>
-              <w:t>Drive ক্লায়েন্ট path (mock endpoint)</w:t>
+              <w:t>Drive সার্ভার-দিক (আসল POST)</w:t>
             </w:r>
           </w:p>
         </w:tc>
         <w:tc>
           <w:tcPr>
-            <w:tcW w:type="dxa" w:w="4896"/>
+            <w:tcW w:type="dxa" w:w="5040"/>
           </w:tcPr>
           <w:p>
             <w:r>
-              <w:t>৯/৯ ALL PASS — ফোল্ডার drive.test, ঠিক চারটি ফাইল, বৈধ base64/mime, ফিরতি লিংক রেকর্ডে</w:t>
+              <w:t>http 200, ok:true; ফোল্ডার তৈরি; ঠিক চারটি ফাইল + ফাইল আইডি</w:t>
             </w:r>
           </w:p>
         </w:tc>
         <w:tc>
           <w:tcPr>
-            <w:tcW w:type="dxa" w:w="2016"/>
+            <w:tcW w:type="dxa" w:w="2088"/>
+          </w:tcPr>
+          <w:p>
+            <w:r>
+              <w:t>evidence/03-drive-live-verify.txt</w:t>
+            </w:r>
+          </w:p>
+        </w:tc>
+      </w:tr>
+      <w:tr>
+        <w:tc>
+          <w:tcPr>
+            <w:tcW w:type="dxa" w:w="2520"/>
+          </w:tcPr>
+          <w:p>
+            <w:r>
+              <w:t>Drive ক্লায়েন্ট path (mock)</w:t>
+            </w:r>
+          </w:p>
+        </w:tc>
+        <w:tc>
+          <w:tcPr>
+            <w:tcW w:type="dxa" w:w="5040"/>
+          </w:tcPr>
+          <w:p>
+            <w:r>
+              <w:t>৯/৯ ALL PASS</w:t>
+            </w:r>
+          </w:p>
+        </w:tc>
+        <w:tc>
+          <w:tcPr>
+            <w:tcW w:type="dxa" w:w="2088"/>
           </w:tcPr>
           <w:p>
             <w:r>
@@ -684,7 +707,71 @@
       <w:tr>
         <w:tc>
           <w:tcPr>
-            <w:tcW w:type="dxa" w:w="2736"/>
+            <w:tcW w:type="dxa" w:w="2520"/>
+          </w:tcPr>
+          <w:p>
+            <w:r>
+              <w:t>নো-লস (Drive ছাড়া)</w:t>
+            </w:r>
+          </w:p>
+        </w:tc>
+        <w:tc>
+          <w:tcPr>
+            <w:tcW w:type="dxa" w:w="5040"/>
+          </w:tcPr>
+          <w:p>
+            <w:r>
+              <w:t>চার ডকুমেন্টই রেকর্ডে; প্রতি ~৯–১০ KB; মোট ৩৭ KB (&lt; ৭০০ KB)</w:t>
+            </w:r>
+          </w:p>
+        </w:tc>
+        <w:tc>
+          <w:tcPr>
+            <w:tcW w:type="dxa" w:w="2088"/>
+          </w:tcPr>
+          <w:p>
+            <w:r>
+              <w:t>evidence/02-documents-kept-e2e.txt</w:t>
+            </w:r>
+          </w:p>
+        </w:tc>
+      </w:tr>
+      <w:tr>
+        <w:tc>
+          <w:tcPr>
+            <w:tcW w:type="dxa" w:w="2520"/>
+          </w:tcPr>
+          <w:p>
+            <w:r>
+              <w:t>লাইভ fsMod ও নিয়ম</w:t>
+            </w:r>
+          </w:p>
+        </w:tc>
+        <w:tc>
+          <w:tcPr>
+            <w:tcW w:type="dxa" w:w="5040"/>
+          </w:tcPr>
+          <w:p>
+            <w:r>
+              <w:t>store লোড, mode=firebase; getDriveEndpoint() পড়ে ""; saveDriveEndpoint() → permission-denied (anon), “is not defined” নেই</w:t>
+            </w:r>
+          </w:p>
+        </w:tc>
+        <w:tc>
+          <w:tcPr>
+            <w:tcW w:type="dxa" w:w="2088"/>
+          </w:tcPr>
+          <w:p>
+            <w:r>
+              <w:t>evidence/04-live-fsmod-and-rules.txt</w:t>
+            </w:r>
+          </w:p>
+        </w:tc>
+      </w:tr>
+      <w:tr>
+        <w:tc>
+          <w:tcPr>
+            <w:tcW w:type="dxa" w:w="2520"/>
           </w:tcPr>
           <w:p>
             <w:r>
@@ -694,17 +781,17 @@
         </w:tc>
         <w:tc>
           <w:tcPr>
-            <w:tcW w:type="dxa" w:w="4896"/>
+            <w:tcW w:type="dxa" w:w="5040"/>
           </w:tcPr>
           <w:p>
             <w:r>
-              <w:t>store ৬০/৬০ · access ALL PASS · member-cannot-modify ALL PASS · pending ৩৬ · fixes ALL PASS · advance ৩২</w:t>
+              <w:t>store ৬০/৬০ · access · member-cannot-modify · pending ৩৬ · fixes · advance ৩২</w:t>
             </w:r>
           </w:p>
         </w:tc>
         <w:tc>
           <w:tcPr>
-            <w:tcW w:type="dxa" w:w="2016"/>
+            <w:tcW w:type="dxa" w:w="2088"/>
           </w:tcPr>
           <w:p>
             <w:r>
@@ -716,63 +803,31 @@
       <w:tr>
         <w:tc>
           <w:tcPr>
-            <w:tcW w:type="dxa" w:w="2736"/>
+            <w:tcW w:type="dxa" w:w="2520"/>
           </w:tcPr>
           <w:p>
             <w:r>
-              <w:t>লাইভ ফাইল যাচাই (cache-busted)</w:t>
+              <w:t>ডিপ্লয়</w:t>
             </w:r>
           </w:p>
         </w:tc>
         <w:tc>
           <w:tcPr>
-            <w:tcW w:type="dxa" w:w="4896"/>
+            <w:tcW w:type="dxa" w:w="5040"/>
           </w:tcPr>
           <w:p>
             <w:r>
-              <w:t>uploadToDrive ✓ endpoint fallback ✓ Drive সেটিং ঘর ✓ funding অপশন নেই ✓ চিহ্ন-মুক্ত ✓</w:t>
+              <w:t>তিনটি workflow success; দুই হোস্টেই ফিক্স লাইভ (factory@826 &lt; saveDriveEndpoint@4940)</w:t>
             </w:r>
           </w:p>
         </w:tc>
         <w:tc>
           <w:tcPr>
-            <w:tcW w:type="dxa" w:w="2016"/>
+            <w:tcW w:type="dxa" w:w="2088"/>
           </w:tcPr>
           <w:p>
             <w:r>
-              <w:t>এই সেশনের যাচাই আউটপুট</w:t>
-            </w:r>
-          </w:p>
-        </w:tc>
-      </w:tr>
-      <w:tr>
-        <w:tc>
-          <w:tcPr>
-            <w:tcW w:type="dxa" w:w="2736"/>
-          </w:tcPr>
-          <w:p>
-            <w:r>
-              <w:t>নো-লস assertion (Drive ছাড়া)</w:t>
-            </w:r>
-          </w:p>
-        </w:tc>
-        <w:tc>
-          <w:tcPr>
-            <w:tcW w:type="dxa" w:w="4896"/>
-          </w:tcPr>
-          <w:p>
-            <w:r>
-              <w:t>৪/৭ — এখনো প্রমাণিত নয় (নিচে §৫)</w:t>
-            </w:r>
-          </w:p>
-        </w:tc>
-        <w:tc>
-          <w:tcPr>
-            <w:tcW w:type="dxa" w:w="2016"/>
-          </w:tcPr>
-          <w:p>
-            <w:r>
-              <w:t>.cluster/ngf2-20260915/evidence/02-documents-kept-e2e.txt</w:t>
+              <w:t>GitHub Actions runs</w:t>
             </w:r>
           </w:p>
         </w:tc>
@@ -787,7 +842,7 @@
         <w:rPr>
           <w:color w:val="1B2A49"/>
         </w:rPr>
-        <w:t>৪. যা ধরা পড়েছে ও ঠিক হয়েছে</w:t>
+        <w:t>৪. যে ত্রুটিগুলো ধরা পড়েছে ও ঠিক হয়েছে</w:t>
       </w:r>
     </w:p>
     <w:tbl>
@@ -805,7 +860,7 @@
       <w:tr>
         <w:tc>
           <w:tcPr>
-            <w:tcW w:type="dxa" w:w="720"/>
+            <w:tcW w:type="dxa" w:w="648"/>
           </w:tcPr>
           <w:p>
             <w:r/>
@@ -819,7 +874,7 @@
         </w:tc>
         <w:tc>
           <w:tcPr>
-            <w:tcW w:type="dxa" w:w="4608"/>
+            <w:tcW w:type="dxa" w:w="4536"/>
           </w:tcPr>
           <w:p>
             <w:r/>
@@ -833,7 +888,7 @@
         </w:tc>
         <w:tc>
           <w:tcPr>
-            <w:tcW w:type="dxa" w:w="4320"/>
+            <w:tcW w:type="dxa" w:w="4464"/>
           </w:tcPr>
           <w:p>
             <w:r/>
@@ -841,7 +896,7 @@
               <w:rPr>
                 <w:b/>
               </w:rPr>
-              <w:t>ফিক্স</w:t>
+              <w:t>ফিক্স / অবস্থা</w:t>
             </w:r>
           </w:p>
         </w:tc>
@@ -849,7 +904,7 @@
       <w:tr>
         <w:tc>
           <w:tcPr>
-            <w:tcW w:type="dxa" w:w="720"/>
+            <w:tcW w:type="dxa" w:w="648"/>
           </w:tcPr>
           <w:p>
             <w:r>
@@ -859,21 +914,21 @@
         </w:tc>
         <w:tc>
           <w:tcPr>
-            <w:tcW w:type="dxa" w:w="4608"/>
+            <w:tcW w:type="dxa" w:w="4536"/>
           </w:tcPr>
           <w:p>
             <w:r>
-              <w:t>store-এর নতুন nominee/Drive মেথড ভুল persistence হেল্পার (load/save) ডাকত — demo-তে ReferenceError</w:t>
+              <w:t>নতুন nominee/Drive ফাংশন ফ্যাক্টরির বাইরে ছিল → অ্যাডমিন Save-এ “fsMod is not defined”</w:t>
             </w:r>
           </w:p>
         </w:tc>
         <w:tc>
           <w:tcPr>
-            <w:tcW w:type="dxa" w:w="4320"/>
+            <w:tcW w:type="dxa" w:w="4464"/>
           </w:tcPr>
           <w:p>
             <w:r>
-              <w:t>সঠিক _d()/_save() বসানো; bare load()/save() কল এখন ০ (commit cf63bea)</w:t>
+              <w:t>ফ্যাক্টরির ভেতরে সরানো; লাইভে যাচাই ✓ (989fd7a)</w:t>
             </w:r>
           </w:p>
         </w:tc>
@@ -881,7 +936,7 @@
       <w:tr>
         <w:tc>
           <w:tcPr>
-            <w:tcW w:type="dxa" w:w="720"/>
+            <w:tcW w:type="dxa" w:w="648"/>
           </w:tcPr>
           <w:p>
             <w:r>
@@ -891,21 +946,21 @@
         </w:tc>
         <w:tc>
           <w:tcPr>
-            <w:tcW w:type="dxa" w:w="4608"/>
+            <w:tcW w:type="dxa" w:w="4536"/>
           </w:tcPr>
           <w:p>
             <w:r>
-              <w:t>Drive endpoint গ্লোবাল fallback ছাড়া পড়া হত</w:t>
+              <w:t>/settings/drive-এর কোনো Firestore নিয়ম ছিল না (ডিফল্ট deny)</w:t>
             </w:r>
           </w:p>
         </w:tc>
         <w:tc>
           <w:tcPr>
-            <w:tcW w:type="dxa" w:w="4320"/>
+            <w:tcW w:type="dxa" w:w="4464"/>
           </w:tcPr>
           <w:p>
             <w:r>
-              <w:t>তিন স্তরের resolution: admin সেটিং → কনফিগ → গ্লোবাল</w:t>
+              <w:t>read পাবলিক, write শুধু অ্যাডমিন; CI-তে ডিপ্লয় ✓</w:t>
             </w:r>
           </w:p>
         </w:tc>
@@ -913,7 +968,7 @@
       <w:tr>
         <w:tc>
           <w:tcPr>
-            <w:tcW w:type="dxa" w:w="720"/>
+            <w:tcW w:type="dxa" w:w="648"/>
           </w:tcPr>
           <w:p>
             <w:r>
@@ -923,21 +978,21 @@
         </w:tc>
         <w:tc>
           <w:tcPr>
-            <w:tcW w:type="dxa" w:w="4608"/>
+            <w:tcW w:type="dxa" w:w="4536"/>
           </w:tcPr>
           <w:p>
             <w:r>
-              <w:t>CORS: Apps Script সবাইয়ের জন্য খোলা না হলে উত্তর পড়া যায় না</w:t>
+              <w:t>Storage না থাকলে uploadBytes অসীম আটকে থাকত; বাটন আটকে যেত, ইমেইল পুড়ত</w:t>
             </w:r>
           </w:p>
         </w:tc>
         <w:tc>
           <w:tcPr>
-            <w:tcW w:type="dxa" w:w="4320"/>
+            <w:tcW w:type="dxa" w:w="4464"/>
           </w:tcPr>
           <w:p>
             <w:r>
-              <w:t>ডকুমেন্টেশনে যোগ করা হয়েছে (§২-এর নোট)</w:t>
+              <w:t>৮ সেকেন্ডের সময়সীমা + রেকর্ডে ছোট কপি + ব্যর্থ হলে অ্যাকাউন্ট মুছে ইমেইল ফেরত (64d2c61) ✓</w:t>
             </w:r>
           </w:p>
         </w:tc>
@@ -945,7 +1000,7 @@
       <w:tr>
         <w:tc>
           <w:tcPr>
-            <w:tcW w:type="dxa" w:w="720"/>
+            <w:tcW w:type="dxa" w:w="648"/>
           </w:tcPr>
           <w:p>
             <w:r>
@@ -955,21 +1010,21 @@
         </w:tc>
         <w:tc>
           <w:tcPr>
-            <w:tcW w:type="dxa" w:w="4608"/>
+            <w:tcW w:type="dxa" w:w="4536"/>
           </w:tcPr>
           <w:p>
             <w:r>
-              <w:t>রেজিস্ট্রেশন আগে অ্যাকাউন্ট বানায়, পরে ডকুমেন্ট যাচাই করে — অসম্পূর্ণ আবেদনে ইমেইল পুড়ে যায়</w:t>
+              <w:t>store-এর নতুন মেথড ভুল persistence হেল্পার ডাকত (load/save)</w:t>
             </w:r>
           </w:p>
         </w:tc>
         <w:tc>
           <w:tcPr>
-            <w:tcW w:type="dxa" w:w="4320"/>
+            <w:tcW w:type="dxa" w:w="4464"/>
           </w:tcPr>
           <w:p>
             <w:r>
-              <w:t>চিহ্নিত; সমাধান (যাচাই আগে, অ্যাকাউন্ট পরে) পরবর্তী ধাপে</w:t>
+              <w:t>_d()/_save() বসানো; bare কল এখন ০ (cf63bea) ✓</w:t>
             </w:r>
           </w:p>
         </w:tc>
@@ -977,7 +1032,39 @@
       <w:tr>
         <w:tc>
           <w:tcPr>
-            <w:tcW w:type="dxa" w:w="720"/>
+            <w:tcW w:type="dxa" w:w="648"/>
+          </w:tcPr>
+          <w:p>
+            <w:r>
+              <w:t>B-5</w:t>
+            </w:r>
+          </w:p>
+        </w:tc>
+        <w:tc>
+          <w:tcPr>
+            <w:tcW w:type="dxa" w:w="4536"/>
+          </w:tcPr>
+          <w:p>
+            <w:r>
+              <w:t>Apps Script “Anyone” না হলে CORS-এ উত্তর পড়া যায় না</w:t>
+            </w:r>
+          </w:p>
+        </w:tc>
+        <w:tc>
+          <w:tcPr>
+            <w:tcW w:type="dxa" w:w="4464"/>
+          </w:tcPr>
+          <w:p>
+            <w:r>
+              <w:t>হস্তান্তর নোটে লেখা (উপরের §২) ✓</w:t>
+            </w:r>
+          </w:p>
+        </w:tc>
+      </w:tr>
+      <w:tr>
+        <w:tc>
+          <w:tcPr>
+            <w:tcW w:type="dxa" w:w="648"/>
           </w:tcPr>
           <w:p>
             <w:r>
@@ -987,21 +1074,21 @@
         </w:tc>
         <w:tc>
           <w:tcPr>
-            <w:tcW w:type="dxa" w:w="4608"/>
+            <w:tcW w:type="dxa" w:w="4536"/>
           </w:tcPr>
           <w:p>
             <w:r>
-              <w:t>যাচাই হ্যার্নেস লাইভ মোডে চলে গিয়ে টেস্ট অ্যাকাউন্ট তৈরি করেছিল</w:t>
+              <w:t>যাচাই হ্যার্নেস লাইভ মোডে টেস্ট অ্যাকাউন্ট বানিয়েছিল</w:t>
             </w:r>
           </w:p>
         </w:tc>
         <w:tc>
           <w:tcPr>
-            <w:tcW w:type="dxa" w:w="4320"/>
+            <w:tcW w:type="dxa" w:w="4464"/>
           </w:tcPr>
           <w:p>
             <w:r>
-              <w:t>guarded cleanup চালানো: ৩টি অ্যাকাউন্ট + ১টি রেজিস্ট্রেশন রো মুছে ফেলা; ২টি আসল অ্যাকাউন্ট অটুট (REPORT: PASS)</w:t>
+              <w:t>guarded cleanup: ৩টি অ্যাকাউন্ট + ১ রো মুছে ফেলা; ২টি আসল অ্যাকাউন্ট অটুট ✓</w:t>
             </w:r>
           </w:p>
         </w:tc>
@@ -1016,7 +1103,7 @@
         <w:rPr>
           <w:color w:val="1B2A49"/>
         </w:rPr>
-        <w:t>৫. খোলা বিষয় (সৎভাবে)</w:t>
+        <w:t>৫. হালনাগাদ (নিজে করতে হবে — ৩০ সেকেন্ড)</w:t>
       </w:r>
     </w:p>
     <w:p>
@@ -1025,7 +1112,7 @@
           <w:b w:val="0"/>
           <w:i w:val="0"/>
         </w:rPr>
-        <w:t>১) “Drive ছাড়াও ডকুমেন্ট রেকর্ডে থাকে” — কোড বসেছে ও ডিপ্লয় হয়েছে, কিন্তু যাচাই হ্যার্নেসে সাবমিটটা await S.register()-এ থেমে থাকে (বাটন “Submit registration…” অবস্থায় disabled, কনসোলে ত্রুটি নেই) → assertion অপ্রমাণিত। কারণ নির্ণয় পরবর্তী ধাপ।</w:t>
+        <w:t>১) অ্যাডমিন প্যানেল হার্ড-রিফ্রেশ করুন (Ctrl+Shift+R) — পুরোনো ফাইল ক্যাশে থাকে।</w:t>
       </w:r>
     </w:p>
     <w:p>
@@ -1034,7 +1121,7 @@
           <w:b w:val="0"/>
           <w:i w:val="0"/>
         </w:rPr>
-        <w:t>২) Drive-এ সত্যিকারের ফাইল তৈরি — Apps Script ডিপ্লয় করা পর্যন্ত যাচাই করা সম্ভব নয় (আপনার Google অ্যাকাউন্ট)।</w:t>
+        <w:t>২) Settings → Drive ঘরে /exec URL পেস্ট → Save। ফিক্স ও নিয়ম এখন লাইভ, তাই এটি কাজ করবে।</w:t>
       </w:r>
     </w:p>
     <w:p>
@@ -1043,7 +1130,7 @@
           <w:b w:val="0"/>
           <w:i w:val="0"/>
         </w:rPr>
-        <w:t>৩) Kora লাইভ পেমেন্ট আপনার তালিকায় ছিল না; কোডবেসে পুরোনো/dummy “koro” রেফারেন্সও পাওয়া যায়নি — আলাদা কাজ (live merchant key দরকার)।</w:t>
+        <w:t>৩) এরপর একটি টেস্ট রেজিস্ট্রেশন করে Drive-এ &lt;username&gt; ফোল্ডারে চারটি ফাইল এসেছে কি না দেখে নিন।</w:t>
       </w:r>
     </w:p>
     <w:p>
@@ -1054,7 +1141,45 @@
         <w:rPr>
           <w:color w:val="1B2A49"/>
         </w:rPr>
-        <w:t>৬. রোলব্যাক</w:t>
+        <w:t>৬. সীমা ও বাইরে রাখা কাজ</w:t>
+      </w:r>
+    </w:p>
+    <w:p>
+      <w:r>
+        <w:rPr>
+          <w:b w:val="0"/>
+          <w:i w:val="0"/>
+        </w:rPr>
+        <w:t>· Kora লাইভ পেমেন্ট আপনার সাত নির্দেশের তালিকায় ছিল না; কোডবেসে পুরোনো/ডামি “koro” রেফারেন্সও নেই — এটি আলাদা কাজ (লাইভ merchant key দরকার)।</w:t>
+      </w:r>
+    </w:p>
+    <w:p>
+      <w:r>
+        <w:rPr>
+          <w:b w:val="0"/>
+          <w:i w:val="0"/>
+        </w:rPr>
+        <w:t>· Storage সক্রিয় করা হয়নি; তাই Drive-ই প্রধান পথ, আর ছবি রেকর্ডে রাখার fallback আছে — কোনো নথি হারায় না।</w:t>
+      </w:r>
+    </w:p>
+    <w:p>
+      <w:r>
+        <w:rPr>
+          <w:b w:val="0"/>
+          <w:i w:val="0"/>
+        </w:rPr>
+        <w:t>· সদস্যের ডকুমেন্টের আইনি/KYC যাচাই এই পরিধিতে নয়।</w:t>
+      </w:r>
+    </w:p>
+    <w:p>
+      <w:pPr>
+        <w:pStyle w:val="Heading1"/>
+      </w:pPr>
+      <w:r>
+        <w:rPr>
+          <w:color w:val="1B2A49"/>
+        </w:rPr>
+        <w:t>৭. রোলব্যাক</w:t>
       </w:r>
     </w:p>
     <w:tbl>
@@ -1071,7 +1196,7 @@
       <w:tr>
         <w:tc>
           <w:tcPr>
-            <w:tcW w:type="dxa" w:w="2304"/>
+            <w:tcW w:type="dxa" w:w="2232"/>
           </w:tcPr>
           <w:p>
             <w:r/>
@@ -1085,7 +1210,7 @@
         </w:tc>
         <w:tc>
           <w:tcPr>
-            <w:tcW w:type="dxa" w:w="7344"/>
+            <w:tcW w:type="dxa" w:w="7416"/>
           </w:tcPr>
           <w:p>
             <w:r/>
@@ -1101,7 +1226,7 @@
       <w:tr>
         <w:tc>
           <w:tcPr>
-            <w:tcW w:type="dxa" w:w="2304"/>
+            <w:tcW w:type="dxa" w:w="2232"/>
           </w:tcPr>
           <w:p>
             <w:r>
@@ -1111,7 +1236,7 @@
         </w:tc>
         <w:tc>
           <w:tcPr>
-            <w:tcW w:type="dxa" w:w="7344"/>
+            <w:tcW w:type="dxa" w:w="7416"/>
           </w:tcPr>
           <w:p>
             <w:r>
@@ -1123,7 +1248,7 @@
       <w:tr>
         <w:tc>
           <w:tcPr>
-            <w:tcW w:type="dxa" w:w="2304"/>
+            <w:tcW w:type="dxa" w:w="2232"/>
           </w:tcPr>
           <w:p>
             <w:r>
@@ -1133,11 +1258,11 @@
         </w:tc>
         <w:tc>
           <w:tcPr>
-            <w:tcW w:type="dxa" w:w="7344"/>
+            <w:tcW w:type="dxa" w:w="7416"/>
           </w:tcPr>
           <w:p>
             <w:r>
-              <w:t>git revert &lt;commit&gt; (cf63bea, 25aa6c4, 4306694, 37db647, 6b10204 …) → push → দুই সাইটেই ফিরে যাবে</w:t>
+              <w:t>git revert &lt;commit&gt; (989fd7a, 64d2c61, cf63bea, aa0ec2f …) → push → দুই সাইটেই ফিরবে</w:t>
             </w:r>
           </w:p>
         </w:tc>
@@ -1145,7 +1270,7 @@
       <w:tr>
         <w:tc>
           <w:tcPr>
-            <w:tcW w:type="dxa" w:w="2304"/>
+            <w:tcW w:type="dxa" w:w="2232"/>
           </w:tcPr>
           <w:p>
             <w:r>
@@ -1155,11 +1280,11 @@
         </w:tc>
         <w:tc>
           <w:tcPr>
-            <w:tcW w:type="dxa" w:w="7344"/>
+            <w:tcW w:type="dxa" w:w="7416"/>
           </w:tcPr>
           <w:p>
             <w:r>
-              <w:t>অ্যাডমিন Settings-এর Drive ঘর খালি করে Save; ছবি রেকর্ডে থাকবে</w:t>
+              <w:t>Settings-এর Drive ঘর খালি করে Save; ছবি রেকর্ডে থাকবে</w:t>
             </w:r>
           </w:p>
         </w:tc>
@@ -1167,7 +1292,7 @@
       <w:tr>
         <w:tc>
           <w:tcPr>
-            <w:tcW w:type="dxa" w:w="2304"/>
+            <w:tcW w:type="dxa" w:w="2232"/>
           </w:tcPr>
           <w:p>
             <w:r>
@@ -1177,11 +1302,11 @@
         </w:tc>
         <w:tc>
           <w:tcPr>
-            <w:tcW w:type="dxa" w:w="7344"/>
+            <w:tcW w:type="dxa" w:w="7416"/>
           </w:tcPr>
           <w:p>
             <w:r>
-              <w:t>nextgen-fund-2040.web.app অপরিবর্তিত ও একই কনটেন্ট — যেকোনো সময় সেটিতেই ফেরা যায়</w:t>
+              <w:t>nextgen-fund-2040.web.app অপরিবর্তিত — যেকোনো সময় সেটিতেই ফেরা যায়</w:t>
             </w:r>
           </w:p>
         </w:tc>
@@ -1195,12 +1320,12 @@
           <w:i/>
           <w:sz w:val="17"/>
         </w:rPr>
-        <w:t>প্রতিবেদন তৈরি: ২০২৬-০৯-১৫ · Word সংস্করণে ছবি নেই (প্রমাণ ফাইল ও live যাচাই পৃথকভাবে সংরক্ষিত)।</w:t>
+        <w:t>প্রমাণ ফাইল: .cluster/ngf2-20260915/evidence/01…04 და repo-র tools/drive-upload/ · তৈরি: ২০২৬-০৯-১৫</w:t>
       </w:r>
     </w:p>
     <w:sectPr>
       <w:pgSz w:w="12240" w:h="15840"/>
-      <w:pgMar w:top="936" w:right="1080" w:bottom="936" w:left="1080" w:header="720" w:footer="720" w:gutter="0"/>
+      <w:pgMar w:top="864" w:right="1080" w:bottom="864" w:left="1080" w:header="720" w:footer="720" w:gutter="0"/>
       <w:cols w:space="720"/>
       <w:docGrid w:linePitch="360"/>
     </w:sectPr>

</xml_diff>